<commit_message>
Organize project folders, add clean_data.ipynb and requirements
</commit_message>
<xml_diff>
--- a/workbook.docx
+++ b/workbook.docx
@@ -68,10 +68,10 @@
             <v:path o:extrusionok="f" gradientshapeok="t" o:connecttype="rect"/>
             <o:lock v:ext="edit" aspectratio="t"/>
           </v:shapetype>
-          <v:shape id="_x0000_i1210" type="#_x0000_t75" style="width:21pt;height:18pt" o:ole="">
-            <v:imagedata r:id="rId5" o:title=""/>
-          </v:shape>
-          <w:control r:id="rId6" w:name="DefaultOcxName" w:shapeid="_x0000_i1210"/>
+          <v:shape id="_x0000_i1220" type="#_x0000_t75" style="width:21pt;height:18pt" o:ole="">
+            <v:imagedata r:id="rId5" o:title=""/>
+          </v:shape>
+          <w:control r:id="rId6" w:name="DefaultOcxName" w:shapeid="_x0000_i1220"/>
         </w:object>
       </w:r>
       <w:r>
@@ -106,10 +106,10 @@
           <w:lang w:eastAsia="en-IN"/>
         </w:rPr>
         <w:object w:dxaOrig="1440" w:dyaOrig="1440" w14:anchorId="4C5F8039">
-          <v:shape id="_x0000_i1209" type="#_x0000_t75" style="width:21pt;height:18pt" o:ole="">
-            <v:imagedata r:id="rId5" o:title=""/>
-          </v:shape>
-          <w:control r:id="rId7" w:name="DefaultOcxName1" w:shapeid="_x0000_i1209"/>
+          <v:shape id="_x0000_i1221" type="#_x0000_t75" style="width:21pt;height:18pt" o:ole="">
+            <v:imagedata r:id="rId5" o:title=""/>
+          </v:shape>
+          <w:control r:id="rId7" w:name="DefaultOcxName1" w:shapeid="_x0000_i1221"/>
         </w:object>
       </w:r>
       <w:r>
@@ -144,10 +144,10 @@
           <w:lang w:eastAsia="en-IN"/>
         </w:rPr>
         <w:object w:dxaOrig="1440" w:dyaOrig="1440" w14:anchorId="06C6DBEF">
-          <v:shape id="_x0000_i1208" type="#_x0000_t75" style="width:21pt;height:18pt" o:ole="">
-            <v:imagedata r:id="rId5" o:title=""/>
-          </v:shape>
-          <w:control r:id="rId8" w:name="DefaultOcxName2" w:shapeid="_x0000_i1208"/>
+          <v:shape id="_x0000_i1215" type="#_x0000_t75" style="width:21pt;height:18pt" o:ole="">
+            <v:imagedata r:id="rId5" o:title=""/>
+          </v:shape>
+          <w:control r:id="rId8" w:name="DefaultOcxName2" w:shapeid="_x0000_i1215"/>
         </w:object>
       </w:r>
       <w:r>
@@ -220,10 +220,10 @@
           <w:lang w:eastAsia="en-IN"/>
         </w:rPr>
         <w:object w:dxaOrig="1440" w:dyaOrig="1440" w14:anchorId="358BC95F">
-          <v:shape id="_x0000_i1206" type="#_x0000_t75" style="width:21pt;height:18pt" o:ole="">
-            <v:imagedata r:id="rId5" o:title=""/>
-          </v:shape>
-          <w:control r:id="rId10" w:name="DefaultOcxName4" w:shapeid="_x0000_i1206"/>
+          <v:shape id="_x0000_i1222" type="#_x0000_t75" style="width:21pt;height:18pt" o:ole="">
+            <v:imagedata r:id="rId5" o:title=""/>
+          </v:shape>
+          <w:control r:id="rId10" w:name="DefaultOcxName4" w:shapeid="_x0000_i1222"/>
         </w:object>
       </w:r>
       <w:r>
@@ -420,10 +420,10 @@
           <w:lang w:eastAsia="en-IN"/>
         </w:rPr>
         <w:object w:dxaOrig="1440" w:dyaOrig="1440" w14:anchorId="2BE87990">
-          <v:shape id="_x0000_i1204" type="#_x0000_t75" style="width:21pt;height:18pt" o:ole="">
-            <v:imagedata r:id="rId5" o:title=""/>
-          </v:shape>
-          <w:control r:id="rId12" w:name="DefaultOcxName6" w:shapeid="_x0000_i1204"/>
+          <v:shape id="_x0000_i1216" type="#_x0000_t75" style="width:21pt;height:18pt" o:ole="">
+            <v:imagedata r:id="rId12" o:title=""/>
+          </v:shape>
+          <w:control r:id="rId13" w:name="DefaultOcxName6" w:shapeid="_x0000_i1216"/>
         </w:object>
       </w:r>
       <w:r>
@@ -494,10 +494,10 @@
           <w:lang w:eastAsia="en-IN"/>
         </w:rPr>
         <w:object w:dxaOrig="1440" w:dyaOrig="1440" w14:anchorId="108C4C60">
-          <v:shape id="_x0000_i1203" type="#_x0000_t75" style="width:21pt;height:18pt" o:ole="">
-            <v:imagedata r:id="rId5" o:title=""/>
-          </v:shape>
-          <w:control r:id="rId13" w:name="DefaultOcxName7" w:shapeid="_x0000_i1203"/>
+          <v:shape id="_x0000_i1224" type="#_x0000_t75" style="width:21pt;height:18pt" o:ole="">
+            <v:imagedata r:id="rId12" o:title=""/>
+          </v:shape>
+          <w:control r:id="rId14" w:name="DefaultOcxName7" w:shapeid="_x0000_i1224"/>
         </w:object>
       </w:r>
       <w:r>
@@ -532,10 +532,10 @@
           <w:lang w:eastAsia="en-IN"/>
         </w:rPr>
         <w:object w:dxaOrig="1440" w:dyaOrig="1440" w14:anchorId="715AC827">
-          <v:shape id="_x0000_i1202" type="#_x0000_t75" style="width:21pt;height:18pt" o:ole="">
-            <v:imagedata r:id="rId5" o:title=""/>
-          </v:shape>
-          <w:control r:id="rId14" w:name="DefaultOcxName8" w:shapeid="_x0000_i1202"/>
+          <v:shape id="_x0000_i1219" type="#_x0000_t75" style="width:21pt;height:18pt" o:ole="">
+            <v:imagedata r:id="rId12" o:title=""/>
+          </v:shape>
+          <w:control r:id="rId15" w:name="DefaultOcxName8" w:shapeid="_x0000_i1219"/>
         </w:object>
       </w:r>
       <w:r>
@@ -570,10 +570,10 @@
           <w:lang w:eastAsia="en-IN"/>
         </w:rPr>
         <w:object w:dxaOrig="1440" w:dyaOrig="1440" w14:anchorId="42BD72BC">
-          <v:shape id="_x0000_i1201" type="#_x0000_t75" style="width:21pt;height:18pt" o:ole="">
-            <v:imagedata r:id="rId5" o:title=""/>
-          </v:shape>
-          <w:control r:id="rId15" w:name="DefaultOcxName9" w:shapeid="_x0000_i1201"/>
+          <v:shape id="_x0000_i1223" type="#_x0000_t75" style="width:21pt;height:18pt" o:ole="">
+            <v:imagedata r:id="rId12" o:title=""/>
+          </v:shape>
+          <w:control r:id="rId16" w:name="DefaultOcxName9" w:shapeid="_x0000_i1223"/>
         </w:object>
       </w:r>
       <w:r>
@@ -611,7 +611,7 @@
           <v:shape id="_x0000_i1200" type="#_x0000_t75" style="width:21pt;height:18pt" o:ole="">
             <v:imagedata r:id="rId5" o:title=""/>
           </v:shape>
-          <w:control r:id="rId16" w:name="DefaultOcxName10" w:shapeid="_x0000_i1200"/>
+          <w:control r:id="rId17" w:name="DefaultOcxName10" w:shapeid="_x0000_i1200"/>
         </w:object>
       </w:r>
       <w:r>
@@ -622,6 +622,16 @@
           <w:lang w:eastAsia="en-IN"/>
         </w:rPr>
         <w:t>Inconsistent labels standardized (e.g., "E. coli" vs "Escherichia coli")</w:t>
+      </w:r>
+      <w:r>
+        <w:rPr>
+          <w:rFonts w:ascii="Times New Roman" w:eastAsia="Times New Roman" w:hAnsi="Times New Roman" w:cs="Times New Roman"/>
+          <w:sz w:val="24"/>
+          <w:szCs w:val="24"/>
+          <w:lang w:eastAsia="en-IN"/>
+        </w:rPr>
+        <w:tab/>
+        <w:t>//wasn’t done because the data was in the standardized form</w:t>
       </w:r>
     </w:p>
     <w:p>
@@ -649,7 +659,7 @@
           <v:shape id="_x0000_i1199" type="#_x0000_t75" style="width:21pt;height:18pt" o:ole="">
             <v:imagedata r:id="rId5" o:title=""/>
           </v:shape>
-          <w:control r:id="rId17" w:name="DefaultOcxName11" w:shapeid="_x0000_i1199"/>
+          <w:control r:id="rId18" w:name="DefaultOcxName11" w:shapeid="_x0000_i1199"/>
         </w:object>
       </w:r>
       <w:r>
@@ -661,6 +671,25 @@
         </w:rPr>
         <w:t>Susceptibility values encoded (S/I/R to % resistant, if needed)</w:t>
       </w:r>
+      <w:r>
+        <w:rPr>
+          <w:rFonts w:ascii="Times New Roman" w:eastAsia="Times New Roman" w:hAnsi="Times New Roman" w:cs="Times New Roman"/>
+          <w:sz w:val="24"/>
+          <w:szCs w:val="24"/>
+          <w:lang w:eastAsia="en-IN"/>
+        </w:rPr>
+        <w:tab/>
+      </w:r>
+      <w:r>
+        <w:rPr>
+          <w:rFonts w:ascii="Times New Roman" w:eastAsia="Times New Roman" w:hAnsi="Times New Roman" w:cs="Times New Roman"/>
+          <w:sz w:val="24"/>
+          <w:szCs w:val="24"/>
+          <w:lang w:eastAsia="en-IN"/>
+        </w:rPr>
+        <w:tab/>
+        <w:t>//wasn’t required to be done since the data had numerical values</w:t>
+      </w:r>
     </w:p>
     <w:p>
       <w:pPr>
@@ -684,10 +713,10 @@
           <w:lang w:eastAsia="en-IN"/>
         </w:rPr>
         <w:object w:dxaOrig="1440" w:dyaOrig="1440" w14:anchorId="087D5A72">
-          <v:shape id="_x0000_i1198" type="#_x0000_t75" style="width:21pt;height:18pt" o:ole="">
-            <v:imagedata r:id="rId5" o:title=""/>
-          </v:shape>
-          <w:control r:id="rId18" w:name="DefaultOcxName12" w:shapeid="_x0000_i1198"/>
+          <v:shape id="_x0000_i1225" type="#_x0000_t75" style="width:21pt;height:18pt" o:ole="">
+            <v:imagedata r:id="rId12" o:title=""/>
+          </v:shape>
+          <w:control r:id="rId19" w:name="DefaultOcxName12" w:shapeid="_x0000_i1225"/>
         </w:object>
       </w:r>
       <w:r>
@@ -722,10 +751,10 @@
           <w:lang w:eastAsia="en-IN"/>
         </w:rPr>
         <w:object w:dxaOrig="1440" w:dyaOrig="1440" w14:anchorId="4C03884D">
-          <v:shape id="_x0000_i1197" type="#_x0000_t75" style="width:21pt;height:18pt" o:ole="">
-            <v:imagedata r:id="rId5" o:title=""/>
-          </v:shape>
-          <w:control r:id="rId19" w:name="DefaultOcxName13" w:shapeid="_x0000_i1197"/>
+          <v:shape id="_x0000_i1226" type="#_x0000_t75" style="width:21pt;height:18pt" o:ole="">
+            <v:imagedata r:id="rId12" o:title=""/>
+          </v:shape>
+          <w:control r:id="rId20" w:name="DefaultOcxName13" w:shapeid="_x0000_i1226"/>
         </w:object>
       </w:r>
       <w:r>
@@ -788,7 +817,7 @@
           <v:shape id="_x0000_i1196" type="#_x0000_t75" style="width:21pt;height:18pt" o:ole="">
             <v:imagedata r:id="rId5" o:title=""/>
           </v:shape>
-          <w:control r:id="rId20" w:name="DefaultOcxName14" w:shapeid="_x0000_i1196"/>
+          <w:control r:id="rId21" w:name="DefaultOcxName14" w:shapeid="_x0000_i1196"/>
         </w:object>
       </w:r>
       <w:r>
@@ -826,7 +855,7 @@
           <v:shape id="_x0000_i1195" type="#_x0000_t75" style="width:21pt;height:18pt" o:ole="">
             <v:imagedata r:id="rId5" o:title=""/>
           </v:shape>
-          <w:control r:id="rId21" w:name="DefaultOcxName15" w:shapeid="_x0000_i1195"/>
+          <w:control r:id="rId22" w:name="DefaultOcxName15" w:shapeid="_x0000_i1195"/>
         </w:object>
       </w:r>
       <w:r>
@@ -864,7 +893,7 @@
           <v:shape id="_x0000_i1194" type="#_x0000_t75" style="width:21pt;height:18pt" o:ole="">
             <v:imagedata r:id="rId5" o:title=""/>
           </v:shape>
-          <w:control r:id="rId22" w:name="DefaultOcxName16" w:shapeid="_x0000_i1194"/>
+          <w:control r:id="rId23" w:name="DefaultOcxName16" w:shapeid="_x0000_i1194"/>
         </w:object>
       </w:r>
       <w:r>
@@ -902,7 +931,7 @@
           <v:shape id="_x0000_i1193" type="#_x0000_t75" style="width:21pt;height:18pt" o:ole="">
             <v:imagedata r:id="rId5" o:title=""/>
           </v:shape>
-          <w:control r:id="rId23" w:name="DefaultOcxName17" w:shapeid="_x0000_i1193"/>
+          <w:control r:id="rId24" w:name="DefaultOcxName17" w:shapeid="_x0000_i1193"/>
         </w:object>
       </w:r>
       <w:r>
@@ -940,7 +969,7 @@
           <v:shape id="_x0000_i1192" type="#_x0000_t75" style="width:21pt;height:18pt" o:ole="">
             <v:imagedata r:id="rId5" o:title=""/>
           </v:shape>
-          <w:control r:id="rId24" w:name="DefaultOcxName18" w:shapeid="_x0000_i1192"/>
+          <w:control r:id="rId25" w:name="DefaultOcxName18" w:shapeid="_x0000_i1192"/>
         </w:object>
       </w:r>
       <w:r>
@@ -1003,7 +1032,7 @@
           <v:shape id="_x0000_i1191" type="#_x0000_t75" style="width:21pt;height:18pt" o:ole="">
             <v:imagedata r:id="rId5" o:title=""/>
           </v:shape>
-          <w:control r:id="rId25" w:name="DefaultOcxName19" w:shapeid="_x0000_i1191"/>
+          <w:control r:id="rId26" w:name="DefaultOcxName19" w:shapeid="_x0000_i1191"/>
         </w:object>
       </w:r>
       <w:r>
@@ -1041,7 +1070,7 @@
           <v:shape id="_x0000_i1190" type="#_x0000_t75" style="width:21pt;height:18pt" o:ole="">
             <v:imagedata r:id="rId5" o:title=""/>
           </v:shape>
-          <w:control r:id="rId26" w:name="DefaultOcxName20" w:shapeid="_x0000_i1190"/>
+          <w:control r:id="rId27" w:name="DefaultOcxName20" w:shapeid="_x0000_i1190"/>
         </w:object>
       </w:r>
       <w:r>
@@ -1079,7 +1108,7 @@
           <v:shape id="_x0000_i1189" type="#_x0000_t75" style="width:21pt;height:18pt" o:ole="">
             <v:imagedata r:id="rId5" o:title=""/>
           </v:shape>
-          <w:control r:id="rId27" w:name="DefaultOcxName21" w:shapeid="_x0000_i1189"/>
+          <w:control r:id="rId28" w:name="DefaultOcxName21" w:shapeid="_x0000_i1189"/>
         </w:object>
       </w:r>
       <w:r>
@@ -1117,7 +1146,7 @@
           <v:shape id="_x0000_i1188" type="#_x0000_t75" style="width:21pt;height:18pt" o:ole="">
             <v:imagedata r:id="rId5" o:title=""/>
           </v:shape>
-          <w:control r:id="rId28" w:name="DefaultOcxName22" w:shapeid="_x0000_i1188"/>
+          <w:control r:id="rId29" w:name="DefaultOcxName22" w:shapeid="_x0000_i1188"/>
         </w:object>
       </w:r>
       <w:r>
@@ -1151,11 +1180,12 @@
           <w:szCs w:val="24"/>
           <w:lang w:eastAsia="en-IN"/>
         </w:rPr>
+        <w:lastRenderedPageBreak/>
         <w:object w:dxaOrig="1440" w:dyaOrig="1440" w14:anchorId="33FE5A74">
           <v:shape id="_x0000_i1187" type="#_x0000_t75" style="width:21pt;height:18pt" o:ole="">
             <v:imagedata r:id="rId5" o:title=""/>
           </v:shape>
-          <w:control r:id="rId29" w:name="DefaultOcxName23" w:shapeid="_x0000_i1187"/>
+          <w:control r:id="rId30" w:name="DefaultOcxName23" w:shapeid="_x0000_i1187"/>
         </w:object>
       </w:r>
       <w:r>
@@ -1193,7 +1223,7 @@
           <v:shape id="_x0000_i1186" type="#_x0000_t75" style="width:21pt;height:18pt" o:ole="">
             <v:imagedata r:id="rId5" o:title=""/>
           </v:shape>
-          <w:control r:id="rId30" w:name="DefaultOcxName24" w:shapeid="_x0000_i1186"/>
+          <w:control r:id="rId31" w:name="DefaultOcxName24" w:shapeid="_x0000_i1186"/>
         </w:object>
       </w:r>
       <w:r>
@@ -1227,12 +1257,11 @@
           <w:szCs w:val="24"/>
           <w:lang w:eastAsia="en-IN"/>
         </w:rPr>
-        <w:lastRenderedPageBreak/>
         <w:object w:dxaOrig="1440" w:dyaOrig="1440" w14:anchorId="30B52346">
           <v:shape id="_x0000_i1185" type="#_x0000_t75" style="width:21pt;height:18pt" o:ole="">
             <v:imagedata r:id="rId5" o:title=""/>
           </v:shape>
-          <w:control r:id="rId31" w:name="DefaultOcxName25" w:shapeid="_x0000_i1185"/>
+          <w:control r:id="rId32" w:name="DefaultOcxName25" w:shapeid="_x0000_i1185"/>
         </w:object>
       </w:r>
       <w:r>
@@ -1270,7 +1299,7 @@
           <v:shape id="_x0000_i1184" type="#_x0000_t75" style="width:21pt;height:18pt" o:ole="">
             <v:imagedata r:id="rId5" o:title=""/>
           </v:shape>
-          <w:control r:id="rId32" w:name="DefaultOcxName26" w:shapeid="_x0000_i1184"/>
+          <w:control r:id="rId33" w:name="DefaultOcxName26" w:shapeid="_x0000_i1184"/>
         </w:object>
       </w:r>
       <w:r>
@@ -1308,7 +1337,7 @@
           <v:shape id="_x0000_i1183" type="#_x0000_t75" style="width:21pt;height:18pt" o:ole="">
             <v:imagedata r:id="rId5" o:title=""/>
           </v:shape>
-          <w:control r:id="rId33" w:name="DefaultOcxName27" w:shapeid="_x0000_i1183"/>
+          <w:control r:id="rId34" w:name="DefaultOcxName27" w:shapeid="_x0000_i1183"/>
         </w:object>
       </w:r>
       <w:r>
@@ -1346,7 +1375,7 @@
           <v:shape id="_x0000_i1182" type="#_x0000_t75" style="width:21pt;height:18pt" o:ole="">
             <v:imagedata r:id="rId5" o:title=""/>
           </v:shape>
-          <w:control r:id="rId34" w:name="DefaultOcxName28" w:shapeid="_x0000_i1182"/>
+          <w:control r:id="rId35" w:name="DefaultOcxName28" w:shapeid="_x0000_i1182"/>
         </w:object>
       </w:r>
       <w:r>
@@ -1409,7 +1438,7 @@
           <v:shape id="_x0000_i1181" type="#_x0000_t75" style="width:21pt;height:18pt" o:ole="">
             <v:imagedata r:id="rId5" o:title=""/>
           </v:shape>
-          <w:control r:id="rId35" w:name="DefaultOcxName29" w:shapeid="_x0000_i1181"/>
+          <w:control r:id="rId36" w:name="DefaultOcxName29" w:shapeid="_x0000_i1181"/>
         </w:object>
       </w:r>
       <w:r>
@@ -1447,7 +1476,7 @@
           <v:shape id="_x0000_i1180" type="#_x0000_t75" style="width:21pt;height:18pt" o:ole="">
             <v:imagedata r:id="rId5" o:title=""/>
           </v:shape>
-          <w:control r:id="rId36" w:name="DefaultOcxName30" w:shapeid="_x0000_i1180"/>
+          <w:control r:id="rId37" w:name="DefaultOcxName30" w:shapeid="_x0000_i1180"/>
         </w:object>
       </w:r>
       <w:r>
@@ -1485,7 +1514,7 @@
           <v:shape id="_x0000_i1179" type="#_x0000_t75" style="width:21pt;height:18pt" o:ole="">
             <v:imagedata r:id="rId5" o:title=""/>
           </v:shape>
-          <w:control r:id="rId37" w:name="DefaultOcxName31" w:shapeid="_x0000_i1179"/>
+          <w:control r:id="rId38" w:name="DefaultOcxName31" w:shapeid="_x0000_i1179"/>
         </w:object>
       </w:r>
       <w:r>
@@ -1523,7 +1552,7 @@
           <v:shape id="_x0000_i1178" type="#_x0000_t75" style="width:21pt;height:18pt" o:ole="">
             <v:imagedata r:id="rId5" o:title=""/>
           </v:shape>
-          <w:control r:id="rId38" w:name="DefaultOcxName32" w:shapeid="_x0000_i1178"/>
+          <w:control r:id="rId39" w:name="DefaultOcxName32" w:shapeid="_x0000_i1178"/>
         </w:object>
       </w:r>
       <w:r>
@@ -1561,7 +1590,7 @@
           <v:shape id="_x0000_i1177" type="#_x0000_t75" style="width:21pt;height:18pt" o:ole="">
             <v:imagedata r:id="rId5" o:title=""/>
           </v:shape>
-          <w:control r:id="rId39" w:name="DefaultOcxName33" w:shapeid="_x0000_i1177"/>
+          <w:control r:id="rId40" w:name="DefaultOcxName33" w:shapeid="_x0000_i1177"/>
         </w:object>
       </w:r>
       <w:r>
@@ -1599,7 +1628,7 @@
           <v:shape id="_x0000_i1176" type="#_x0000_t75" style="width:21pt;height:18pt" o:ole="">
             <v:imagedata r:id="rId5" o:title=""/>
           </v:shape>
-          <w:control r:id="rId40" w:name="DefaultOcxName34" w:shapeid="_x0000_i1176"/>
+          <w:control r:id="rId41" w:name="DefaultOcxName34" w:shapeid="_x0000_i1176"/>
         </w:object>
       </w:r>
       <w:r>
@@ -1637,7 +1666,7 @@
           <v:shape id="_x0000_i1175" type="#_x0000_t75" style="width:21pt;height:18pt" o:ole="">
             <v:imagedata r:id="rId5" o:title=""/>
           </v:shape>
-          <w:control r:id="rId41" w:name="DefaultOcxName35" w:shapeid="_x0000_i1175"/>
+          <w:control r:id="rId42" w:name="DefaultOcxName35" w:shapeid="_x0000_i1175"/>
         </w:object>
       </w:r>
       <w:r>
@@ -1700,7 +1729,7 @@
           <v:shape id="_x0000_i1174" type="#_x0000_t75" style="width:21pt;height:18pt" o:ole="">
             <v:imagedata r:id="rId5" o:title=""/>
           </v:shape>
-          <w:control r:id="rId42" w:name="DefaultOcxName36" w:shapeid="_x0000_i1174"/>
+          <w:control r:id="rId43" w:name="DefaultOcxName36" w:shapeid="_x0000_i1174"/>
         </w:object>
       </w:r>
       <w:r>
@@ -1738,7 +1767,7 @@
           <v:shape id="_x0000_i1173" type="#_x0000_t75" style="width:21pt;height:18pt" o:ole="">
             <v:imagedata r:id="rId5" o:title=""/>
           </v:shape>
-          <w:control r:id="rId43" w:name="DefaultOcxName37" w:shapeid="_x0000_i1173"/>
+          <w:control r:id="rId44" w:name="DefaultOcxName37" w:shapeid="_x0000_i1173"/>
         </w:object>
       </w:r>
       <w:r>
@@ -1776,7 +1805,7 @@
           <v:shape id="_x0000_i1172" type="#_x0000_t75" style="width:21pt;height:18pt" o:ole="">
             <v:imagedata r:id="rId5" o:title=""/>
           </v:shape>
-          <w:control r:id="rId44" w:name="DefaultOcxName38" w:shapeid="_x0000_i1172"/>
+          <w:control r:id="rId45" w:name="DefaultOcxName38" w:shapeid="_x0000_i1172"/>
         </w:object>
       </w:r>
       <w:r>
@@ -1814,7 +1843,7 @@
           <v:shape id="_x0000_i1171" type="#_x0000_t75" style="width:21pt;height:18pt" o:ole="">
             <v:imagedata r:id="rId5" o:title=""/>
           </v:shape>
-          <w:control r:id="rId45" w:name="DefaultOcxName39" w:shapeid="_x0000_i1171"/>
+          <w:control r:id="rId46" w:name="DefaultOcxName39" w:shapeid="_x0000_i1171"/>
         </w:object>
       </w:r>
       <w:r>
@@ -1852,7 +1881,7 @@
           <v:shape id="_x0000_i1170" type="#_x0000_t75" style="width:21pt;height:18pt" o:ole="">
             <v:imagedata r:id="rId5" o:title=""/>
           </v:shape>
-          <w:control r:id="rId46" w:name="DefaultOcxName40" w:shapeid="_x0000_i1170"/>
+          <w:control r:id="rId47" w:name="DefaultOcxName40" w:shapeid="_x0000_i1170"/>
         </w:object>
       </w:r>
       <w:r>
@@ -1890,7 +1919,7 @@
           <v:shape id="_x0000_i1169" type="#_x0000_t75" style="width:21pt;height:18pt" o:ole="">
             <v:imagedata r:id="rId5" o:title=""/>
           </v:shape>
-          <w:control r:id="rId47" w:name="DefaultOcxName41" w:shapeid="_x0000_i1169"/>
+          <w:control r:id="rId48" w:name="DefaultOcxName41" w:shapeid="_x0000_i1169"/>
         </w:object>
       </w:r>
       <w:r>
@@ -1928,7 +1957,7 @@
           <v:shape id="_x0000_i1168" type="#_x0000_t75" style="width:21pt;height:18pt" o:ole="">
             <v:imagedata r:id="rId5" o:title=""/>
           </v:shape>
-          <w:control r:id="rId48" w:name="DefaultOcxName42" w:shapeid="_x0000_i1168"/>
+          <w:control r:id="rId49" w:name="DefaultOcxName42" w:shapeid="_x0000_i1168"/>
         </w:object>
       </w:r>
       <w:r>
@@ -1966,7 +1995,7 @@
           <v:shape id="_x0000_i1167" type="#_x0000_t75" style="width:21pt;height:18pt" o:ole="">
             <v:imagedata r:id="rId5" o:title=""/>
           </v:shape>
-          <w:control r:id="rId49" w:name="DefaultOcxName43" w:shapeid="_x0000_i1167"/>
+          <w:control r:id="rId50" w:name="DefaultOcxName43" w:shapeid="_x0000_i1167"/>
         </w:object>
       </w:r>
       <w:r>
@@ -2029,7 +2058,7 @@
           <v:shape id="_x0000_i1166" type="#_x0000_t75" style="width:21pt;height:18pt" o:ole="">
             <v:imagedata r:id="rId5" o:title=""/>
           </v:shape>
-          <w:control r:id="rId50" w:name="DefaultOcxName44" w:shapeid="_x0000_i1166"/>
+          <w:control r:id="rId51" w:name="DefaultOcxName44" w:shapeid="_x0000_i1166"/>
         </w:object>
       </w:r>
       <w:r>
@@ -2067,7 +2096,7 @@
           <v:shape id="_x0000_i1165" type="#_x0000_t75" style="width:21pt;height:18pt" o:ole="">
             <v:imagedata r:id="rId5" o:title=""/>
           </v:shape>
-          <w:control r:id="rId51" w:name="DefaultOcxName45" w:shapeid="_x0000_i1165"/>
+          <w:control r:id="rId52" w:name="DefaultOcxName45" w:shapeid="_x0000_i1165"/>
         </w:object>
       </w:r>
       <w:r>
@@ -2105,7 +2134,7 @@
           <v:shape id="_x0000_i1164" type="#_x0000_t75" style="width:21pt;height:18pt" o:ole="">
             <v:imagedata r:id="rId5" o:title=""/>
           </v:shape>
-          <w:control r:id="rId52" w:name="DefaultOcxName46" w:shapeid="_x0000_i1164"/>
+          <w:control r:id="rId53" w:name="DefaultOcxName46" w:shapeid="_x0000_i1164"/>
         </w:object>
       </w:r>
       <w:r>
@@ -2143,7 +2172,7 @@
           <v:shape id="_x0000_i1163" type="#_x0000_t75" style="width:21pt;height:18pt" o:ole="">
             <v:imagedata r:id="rId5" o:title=""/>
           </v:shape>
-          <w:control r:id="rId53" w:name="DefaultOcxName47" w:shapeid="_x0000_i1163"/>
+          <w:control r:id="rId54" w:name="DefaultOcxName47" w:shapeid="_x0000_i1163"/>
         </w:object>
       </w:r>
       <w:r>
@@ -2178,6 +2207,7 @@
           <w:szCs w:val="24"/>
           <w:lang w:eastAsia="en-IN"/>
         </w:rPr>
+        <w:lastRenderedPageBreak/>
         <w:t>Phase 8: Dashboard in Streamlit (CO4, CO5)</w:t>
       </w:r>
     </w:p>
@@ -2206,7 +2236,7 @@
           <v:shape id="_x0000_i1162" type="#_x0000_t75" style="width:21pt;height:18pt" o:ole="">
             <v:imagedata r:id="rId5" o:title=""/>
           </v:shape>
-          <w:control r:id="rId54" w:name="DefaultOcxName48" w:shapeid="_x0000_i1162"/>
+          <w:control r:id="rId55" w:name="DefaultOcxName48" w:shapeid="_x0000_i1162"/>
         </w:object>
       </w:r>
       <w:r>
@@ -2240,12 +2270,11 @@
           <w:szCs w:val="24"/>
           <w:lang w:eastAsia="en-IN"/>
         </w:rPr>
-        <w:lastRenderedPageBreak/>
         <w:object w:dxaOrig="1440" w:dyaOrig="1440" w14:anchorId="46E556A8">
           <v:shape id="_x0000_i1161" type="#_x0000_t75" style="width:21pt;height:18pt" o:ole="">
             <v:imagedata r:id="rId5" o:title=""/>
           </v:shape>
-          <w:control r:id="rId55" w:name="DefaultOcxName49" w:shapeid="_x0000_i1161"/>
+          <w:control r:id="rId56" w:name="DefaultOcxName49" w:shapeid="_x0000_i1161"/>
         </w:object>
       </w:r>
       <w:r>
@@ -2283,7 +2312,7 @@
           <v:shape id="_x0000_i1160" type="#_x0000_t75" style="width:21pt;height:18pt" o:ole="">
             <v:imagedata r:id="rId5" o:title=""/>
           </v:shape>
-          <w:control r:id="rId56" w:name="DefaultOcxName50" w:shapeid="_x0000_i1160"/>
+          <w:control r:id="rId57" w:name="DefaultOcxName50" w:shapeid="_x0000_i1160"/>
         </w:object>
       </w:r>
       <w:r>
@@ -2321,7 +2350,7 @@
           <v:shape id="_x0000_i1159" type="#_x0000_t75" style="width:21pt;height:18pt" o:ole="">
             <v:imagedata r:id="rId5" o:title=""/>
           </v:shape>
-          <w:control r:id="rId57" w:name="DefaultOcxName51" w:shapeid="_x0000_i1159"/>
+          <w:control r:id="rId58" w:name="DefaultOcxName51" w:shapeid="_x0000_i1159"/>
         </w:object>
       </w:r>
       <w:r>
@@ -2359,7 +2388,7 @@
           <v:shape id="_x0000_i1158" type="#_x0000_t75" style="width:21pt;height:18pt" o:ole="">
             <v:imagedata r:id="rId5" o:title=""/>
           </v:shape>
-          <w:control r:id="rId58" w:name="DefaultOcxName52" w:shapeid="_x0000_i1158"/>
+          <w:control r:id="rId59" w:name="DefaultOcxName52" w:shapeid="_x0000_i1158"/>
         </w:object>
       </w:r>
       <w:r>
@@ -2397,7 +2426,7 @@
           <v:shape id="_x0000_i1157" type="#_x0000_t75" style="width:21pt;height:18pt" o:ole="">
             <v:imagedata r:id="rId5" o:title=""/>
           </v:shape>
-          <w:control r:id="rId59" w:name="DefaultOcxName53" w:shapeid="_x0000_i1157"/>
+          <w:control r:id="rId60" w:name="DefaultOcxName53" w:shapeid="_x0000_i1157"/>
         </w:object>
       </w:r>
       <w:r>
@@ -2435,7 +2464,7 @@
           <v:shape id="_x0000_i1156" type="#_x0000_t75" style="width:21pt;height:18pt" o:ole="">
             <v:imagedata r:id="rId5" o:title=""/>
           </v:shape>
-          <w:control r:id="rId60" w:name="DefaultOcxName54" w:shapeid="_x0000_i1156"/>
+          <w:control r:id="rId61" w:name="DefaultOcxName54" w:shapeid="_x0000_i1156"/>
         </w:object>
       </w:r>
       <w:r>
@@ -2473,7 +2502,7 @@
           <v:shape id="_x0000_i1155" type="#_x0000_t75" style="width:21pt;height:18pt" o:ole="">
             <v:imagedata r:id="rId5" o:title=""/>
           </v:shape>
-          <w:control r:id="rId61" w:name="DefaultOcxName55" w:shapeid="_x0000_i1155"/>
+          <w:control r:id="rId62" w:name="DefaultOcxName55" w:shapeid="_x0000_i1155"/>
         </w:object>
       </w:r>
       <w:r>
@@ -2536,7 +2565,7 @@
           <v:shape id="_x0000_i1154" type="#_x0000_t75" style="width:21pt;height:18pt" o:ole="">
             <v:imagedata r:id="rId5" o:title=""/>
           </v:shape>
-          <w:control r:id="rId62" w:name="DefaultOcxName56" w:shapeid="_x0000_i1154"/>
+          <w:control r:id="rId63" w:name="DefaultOcxName56" w:shapeid="_x0000_i1154"/>
         </w:object>
       </w:r>
       <w:r>
@@ -2574,7 +2603,7 @@
           <v:shape id="_x0000_i1153" type="#_x0000_t75" style="width:21pt;height:18pt" o:ole="">
             <v:imagedata r:id="rId5" o:title=""/>
           </v:shape>
-          <w:control r:id="rId63" w:name="DefaultOcxName57" w:shapeid="_x0000_i1153"/>
+          <w:control r:id="rId64" w:name="DefaultOcxName57" w:shapeid="_x0000_i1153"/>
         </w:object>
       </w:r>
       <w:r>
@@ -2623,7 +2652,7 @@
           <v:shape id="_x0000_i1152" type="#_x0000_t75" style="width:21pt;height:18pt" o:ole="">
             <v:imagedata r:id="rId5" o:title=""/>
           </v:shape>
-          <w:control r:id="rId64" w:name="DefaultOcxName58" w:shapeid="_x0000_i1152"/>
+          <w:control r:id="rId65" w:name="DefaultOcxName58" w:shapeid="_x0000_i1152"/>
         </w:object>
       </w:r>
       <w:r>
@@ -2661,7 +2690,7 @@
           <v:shape id="_x0000_i1151" type="#_x0000_t75" style="width:21pt;height:18pt" o:ole="">
             <v:imagedata r:id="rId5" o:title=""/>
           </v:shape>
-          <w:control r:id="rId65" w:name="DefaultOcxName59" w:shapeid="_x0000_i1151"/>
+          <w:control r:id="rId66" w:name="DefaultOcxName59" w:shapeid="_x0000_i1151"/>
         </w:object>
       </w:r>
       <w:r>
@@ -2699,7 +2728,7 @@
           <v:shape id="_x0000_i1150" type="#_x0000_t75" style="width:21pt;height:18pt" o:ole="">
             <v:imagedata r:id="rId5" o:title=""/>
           </v:shape>
-          <w:control r:id="rId66" w:name="DefaultOcxName60" w:shapeid="_x0000_i1150"/>
+          <w:control r:id="rId67" w:name="DefaultOcxName60" w:shapeid="_x0000_i1150"/>
         </w:object>
       </w:r>
       <w:r>
@@ -2737,7 +2766,7 @@
           <v:shape id="_x0000_i1149" type="#_x0000_t75" style="width:21pt;height:18pt" o:ole="">
             <v:imagedata r:id="rId5" o:title=""/>
           </v:shape>
-          <w:control r:id="rId67" w:name="DefaultOcxName61" w:shapeid="_x0000_i1149"/>
+          <w:control r:id="rId68" w:name="DefaultOcxName61" w:shapeid="_x0000_i1149"/>
         </w:object>
       </w:r>
       <w:r>

</xml_diff>